<commit_message>
chore: unify project branding under Chemistry Lab
</commit_message>
<xml_diff>
--- a/static/docs/ChemistryLab_User_Manual.docx
+++ b/static/docs/ChemistryLab_User_Manual.docx
@@ -13,7 +13,7 @@
           <w:color w:val="0B2C52"/>
           <w:sz w:val="44"/>
         </w:rPr>
-        <w:t>ORCA Web Lab &amp; Quantum Chemistry Computational Suite</w:t>
+        <w:t>Chemistry Lab: Computational Chemistry Suite</w:t>
       </w:r>
     </w:p>
     <w:p>
@@ -128,7 +128,7 @@
                 <w:color w:val="1E293B"/>
                 <w:sz w:val="18"/>
               </w:rPr>
-              <w:t>Open-Access Academic Research Suite (MIT License) • Zero Server Retention Policy</w:t>
+              <w:t>Academic and Non-Commercial Research Suite (ORCA Web Lab License v1.1) • Zero Server Retention Policy</w:t>
               <w:br/>
             </w:r>
             <w:r>
@@ -147,7 +147,7 @@
                 <w:color w:val="1E293B"/>
                 <w:sz w:val="18"/>
               </w:rPr>
-              <w:t>Version 2.5 (Comprehensive Academic Edition) | Last Updated: August 2026</w:t>
+              <w:t>Version 1.0 (Comprehensive Academic Edition) | Last Updated: August 2026</w:t>
             </w:r>
           </w:p>
         </w:tc>
@@ -183,7 +183,7 @@
           <w:color w:val="1E293B"/>
           <w:sz w:val="20"/>
         </w:rPr>
-        <w:t>ORCA Web Lab is a full-stack, cloud-orchestrated computational chemistry suite developed to bridge the gap between advanced ab initio quantum chemical software (ORCA 6.1) and intuitive, publication-grade web exploration. The platform eliminates traditional command-line configuration hurdles while maintaining strict physical rigor, standard spectroscopic conventions, and reproducible quantum mechanical workflows.</w:t>
+        <w:t>Chemistry Lab is a full-stack, cloud-orchestrated computational chemistry suite developed to bridge the gap between advanced ab initio quantum chemical software (ORCA 6.1) and intuitive, publication-grade web exploration. The platform eliminates traditional command-line configuration hurdles while maintaining strict physical rigor, standard spectroscopic conventions, and reproducible quantum mechanical workflows.</w:t>
       </w:r>
     </w:p>
     <w:p>
@@ -317,7 +317,7 @@
                 <w:color w:val="1E293B"/>
                 <w:sz w:val="19"/>
               </w:rPr>
-              <w:t>ORCA Web Lab operates under a strict Zero-Retention Privacy Policy. All Kaggle API credentials, inputs, coordinates, and computation results remain in transient browser storage (localStorage/sessionStorage). No user data or credentials are stored or monetized on any server database.</w:t>
+              <w:t>Chemistry Lab operates under a strict Zero-Retention Privacy Policy. All Kaggle API credentials, inputs, coordinates, and computation results remain in transient browser storage (localStorage/sessionStorage). No user data or credentials are stored or monetized on any server database.</w:t>
             </w:r>
           </w:p>
         </w:tc>
@@ -928,7 +928,7 @@
           <w:color w:val="1E293B"/>
           <w:sz w:val="20"/>
         </w:rPr>
-        <w:t>A flagship capability of ORCA Web Lab is the automated execution of chained multi-step computational workflows across remote Kaggle GPU/CPU instances with full fault tolerance and lossless coordinate inheritance.</w:t>
+        <w:t>A flagship capability of Chemistry Lab is the automated execution of chained multi-step computational workflows across remote Kaggle GPU/CPU instances with full fault tolerance and lossless coordinate inheritance.</w:t>
       </w:r>
     </w:p>
     <w:p>
@@ -1071,7 +1071,7 @@
           <w:color w:val="1E293B"/>
           <w:sz w:val="20"/>
         </w:rPr>
-        <w:t>ORCA Web Lab implements the Latest-OPT Stage Inheritance Algorithm (getWorkflowOptimizedCoords):</w:t>
+        <w:t>Chemistry Lab implements the Latest-OPT Stage Inheritance Algorithm (getWorkflowOptimizedCoords):</w:t>
       </w:r>
     </w:p>
     <w:p>
@@ -1155,7 +1155,7 @@
           <w:color w:val="1E293B"/>
           <w:sz w:val="20"/>
         </w:rPr>
-        <w:t>Standard web tools round coordinates to 6 decimal places (`12.6f`), causing artificial structural strain and gradient spikes in subsequent high-level coupled-cluster or tight SCF runs. ORCA Web Lab eliminates all coordinate truncation: Cartesian tokens are extracted verbatim from ORCA logs and `.xyz` files with 10 to 14 decimal places (e.g., `0.117289123456 Å`), preserving complete quantum geometric fidelity across the entire chain.</w:t>
+        <w:t>Standard web tools round coordinates to 6 decimal places (`12.6f`), causing artificial structural strain and gradient spikes in subsequent high-level coupled-cluster or tight SCF runs. Chemistry Lab eliminates all coordinate truncation: Cartesian tokens are extracted verbatim from ORCA logs and `.xyz` files with 10 to 14 decimal places (e.g., `0.117289123456 Å`), preserving complete quantum geometric fidelity across the entire chain.</w:t>
       </w:r>
     </w:p>
     <w:p>
@@ -2138,7 +2138,7 @@
           <w:color w:val="1E293B"/>
           <w:sz w:val="20"/>
         </w:rPr>
-        <w:t>When publishing research, articles, or computational datasets obtained using ORCA Web Lab, please include the following academic citations for the platform and the underlying software packages:</w:t>
+        <w:t>When publishing research, articles, or computational datasets obtained using Chemistry Lab, please include the following academic citations for the platform and the underlying software packages:</w:t>
       </w:r>
     </w:p>
     <w:p>
@@ -2153,7 +2153,7 @@
           <w:color w:val="0F766E"/>
           <w:sz w:val="25"/>
         </w:rPr>
-        <w:t>7.1 How to Cite ORCA Web Lab</w:t>
+        <w:t>7.1 How to Cite Chemistry Lab</w:t>
       </w:r>
     </w:p>
     <w:p>
@@ -2209,15 +2209,15 @@
                 <w:color w:val="0F172A"/>
                 <w:sz w:val="17"/>
               </w:rPr>
-              <w:t>@software{Hasan2026OrcaWebLab,</w:t>
+              <w:t>@software{Hasan2026ChemistryLab,</w:t>
               <w:br/>
               <w:t xml:space="preserve">  author       = {Hasan, Abdulsalam S.},</w:t>
               <w:br/>
-              <w:t xml:space="preserve">  title        = {{ORCA Web Lab: An Interactive Web-Based Computational Chemistry and Quantum Analysis Suite}},</w:t>
+              <w:t xml:space="preserve">  title        = {{Chemistry Lab: A Web-Based Computational Chemistry Platform}},</w:t>
               <w:br/>
               <w:t xml:space="preserve">  year         = {2026},</w:t>
               <w:br/>
-              <w:t xml:space="preserve">  version      = {2.5},</w:t>
+              <w:t xml:space="preserve">  version      = {1.0.0},</w:t>
               <w:br/>
               <w:t xml:space="preserve">  url          = {https://github.com/abd19990044-commits/chemistry-web-lab},</w:t>
               <w:br/>
@@ -2266,7 +2266,7 @@
           <w:color w:val="1E293B"/>
           <w:sz w:val="20"/>
         </w:rPr>
-        <w:t>Hasan, A. S. ORCA Web Lab, version 2.5; Advanced Quantum Chemical Modeling &amp; Spectroscopic Analysis Platform, 2026. https://github.com/abd19990044-commits/chemistry-web-lab</w:t>
+        <w:t>Hasan, A. S. Chemistry Lab, version 1.0.0; Advanced Computational Chemistry &amp; Spectroscopic Analysis Platform, 2026. https://github.com/abd19990044-commits/chemistry-web-lab</w:t>
       </w:r>
     </w:p>
     <w:p>
@@ -2301,7 +2301,7 @@
           <w:color w:val="1E293B"/>
           <w:sz w:val="20"/>
         </w:rPr>
-        <w:t>Hasan, A. S. (2026). ORCA Web Lab: An Interactive Web-Based Computational Chemistry Suite (Version 2.5) [Computer software]. Retrieved from https://github.com/abd19990044-commits/chemistry-web-lab</w:t>
+        <w:t>Hasan, A. S. (2026). Chemistry Lab: A Web-Based Computational Chemistry Platform (Version 1.0.0) [Computer software]. Retrieved from https://github.com/abd19990044-commits/chemistry-web-lab</w:t>
       </w:r>
     </w:p>
     <w:p>
@@ -2339,7 +2339,7 @@
           <w:color w:val="1E293B"/>
           <w:sz w:val="20"/>
         </w:rPr>
-        <w:t xml:space="preserve"> Neese, F. (2022). Software update: The ORCA program system—Version 5.0. WIREs Comput. Mol. Sci., 12(5), e1606. / Neese, F. et al. (2026). The ORCA Quantum Chemistry Program System (Version 6.1).</w:t>
+        <w:t xml:space="preserve"> Neese, F. (2022). Software update: The ORCA program system - Version 5.0. WIREs Comput. Mol. Sci., 12(5), e1606. / Neese, F. et al. (2026). The ORCA Quantum Chemistry Program System (Version 6.1).</w:t>
       </w:r>
     </w:p>
     <w:p>
@@ -2505,7 +2505,7 @@
         <w:color w:val="6E6E6E"/>
         <w:sz w:val="17"/>
       </w:rPr>
-      <w:t>ORCA Web Lab • Developed by ABDULSALAM S. HASAN • Compatible with ORCA 6.1</w:t>
+      <w:t>Chemistry Lab • Developed by ABDULSALAM S. HASAN • Compatible with ORCA 6.1</w:t>
     </w:r>
   </w:p>
 </w:ftr>
@@ -2524,7 +2524,7 @@
         <w:color w:val="6E6E6E"/>
         <w:sz w:val="17"/>
       </w:rPr>
-      <w:t>ORCA Web Lab — Academic User Manual &amp; Technical Reference Guide</w:t>
+      <w:t>Chemistry Lab - Academic User Manual &amp; Technical Reference Guide</w:t>
     </w:r>
   </w:p>
 </w:hdr>

</xml_diff>

<commit_message>
release: prepare Chemistry Lab v1.0.2
</commit_message>
<xml_diff>
--- a/static/docs/ChemistryLab_User_Manual.docx
+++ b/static/docs/ChemistryLab_User_Manual.docx
@@ -2217,7 +2217,7 @@
               <w:br/>
               <w:t xml:space="preserve">  year         = {2026},</w:t>
               <w:br/>
-              <w:t xml:space="preserve">  version      = {1.0.0},</w:t>
+              <w:t xml:space="preserve">  version      = {1.0.2},</w:t>
               <w:br/>
               <w:t xml:space="preserve">  url          = {https://github.com/abd19990044-commits/chemistry-web-lab},</w:t>
               <w:br/>
@@ -2266,7 +2266,7 @@
           <w:color w:val="1E293B"/>
           <w:sz w:val="20"/>
         </w:rPr>
-        <w:t>Hasan, A. S. Chemistry Lab, version 1.0.0; Advanced Computational Chemistry &amp; Spectroscopic Analysis Platform, 2026. https://github.com/abd19990044-commits/chemistry-web-lab</w:t>
+        <w:t>Hasan, A. S. Chemistry Lab, version 1.0.2; Advanced Computational Chemistry &amp; Spectroscopic Analysis Platform, 2026. https://github.com/abd19990044-commits/chemistry-web-lab</w:t>
       </w:r>
     </w:p>
     <w:p>
@@ -2301,7 +2301,7 @@
           <w:color w:val="1E293B"/>
           <w:sz w:val="20"/>
         </w:rPr>
-        <w:t>Hasan, A. S. (2026). Chemistry Lab: A Web-Based Computational Chemistry Platform (Version 1.0.0) [Computer software]. Retrieved from https://github.com/abd19990044-commits/chemistry-web-lab</w:t>
+        <w:t>Hasan, A. S. (2026). Chemistry Lab: A Web-Based Computational Chemistry Platform (Version 1.0.2) [Computer software]. Retrieved from https://github.com/abd19990044-commits/chemistry-web-lab</w:t>
       </w:r>
     </w:p>
     <w:p>

</xml_diff>

<commit_message>
release: prepare Chemistry Lab v1.0.3
</commit_message>
<xml_diff>
--- a/static/docs/ChemistryLab_User_Manual.docx
+++ b/static/docs/ChemistryLab_User_Manual.docx
@@ -2217,7 +2217,7 @@
               <w:br/>
               <w:t xml:space="preserve">  year         = {2026},</w:t>
               <w:br/>
-              <w:t xml:space="preserve">  version      = {1.0.2},</w:t>
+              <w:t xml:space="preserve">  version      = {1.0.3},</w:t>
               <w:br/>
               <w:t xml:space="preserve">  url          = {https://github.com/abd19990044-commits/chemistry-web-lab},</w:t>
               <w:br/>
@@ -2266,7 +2266,7 @@
           <w:color w:val="1E293B"/>
           <w:sz w:val="20"/>
         </w:rPr>
-        <w:t>Hasan, A. S. Chemistry Lab, version 1.0.2; Advanced Computational Chemistry &amp; Spectroscopic Analysis Platform, 2026. https://github.com/abd19990044-commits/chemistry-web-lab</w:t>
+        <w:t>Hasan, A. S. Chemistry Lab, version 1.0.3; Advanced Computational Chemistry &amp; Spectroscopic Analysis Platform, 2026. https://github.com/abd19990044-commits/chemistry-web-lab</w:t>
       </w:r>
     </w:p>
     <w:p>
@@ -2301,7 +2301,7 @@
           <w:color w:val="1E293B"/>
           <w:sz w:val="20"/>
         </w:rPr>
-        <w:t>Hasan, A. S. (2026). Chemistry Lab: A Web-Based Computational Chemistry Platform (Version 1.0.2) [Computer software]. Retrieved from https://github.com/abd19990044-commits/chemistry-web-lab</w:t>
+        <w:t>Hasan, A. S. (2026). Chemistry Lab: A Web-Based Computational Chemistry Platform (Version 1.0.3) [Computer software]. Retrieved from https://github.com/abd19990044-commits/chemistry-web-lab</w:t>
       </w:r>
     </w:p>
     <w:p>

</xml_diff>

<commit_message>
docs: synchronize Chemistry Lab v1.0.3 DOI and documentation
</commit_message>
<xml_diff>
--- a/static/docs/ChemistryLab_User_Manual.docx
+++ b/static/docs/ChemistryLab_User_Manual.docx
@@ -2219,9 +2219,11 @@
               <w:br/>
               <w:t xml:space="preserve">  version      = {1.0.3},</w:t>
               <w:br/>
-              <w:t xml:space="preserve">  url          = {https://github.com/abd19990044-commits/chemistry-web-lab},</w:t>
+              <w:t xml:space="preserve">  doi          = {10.5281/zenodo.22119038},</w:t>
               <w:br/>
-              <w:t xml:space="preserve">  note         = {Compatible with ORCA 6.1 program system}</w:t>
+              <w:t xml:space="preserve">  url          = {https://doi.org/10.5281/zenodo.22119038},</w:t>
+              <w:br/>
+              <w:t xml:space="preserve">  note         = {Academic and Non-Commercial Research Platform}</w:t>
               <w:br/>
               <w:t>}</w:t>
             </w:r>
@@ -2266,7 +2268,7 @@
           <w:color w:val="1E293B"/>
           <w:sz w:val="20"/>
         </w:rPr>
-        <w:t>Hasan, A. S. Chemistry Lab, version 1.0.3; Advanced Computational Chemistry &amp; Spectroscopic Analysis Platform, 2026. https://github.com/abd19990044-commits/chemistry-web-lab</w:t>
+        <w:t>Hasan, A. S. Chemistry Lab, version 1.0.3; Advanced Computational Chemistry &amp; Spectroscopic Analysis Platform, 2026. https://doi.org/10.5281/zenodo.22119038</w:t>
       </w:r>
     </w:p>
     <w:p>
@@ -2301,7 +2303,7 @@
           <w:color w:val="1E293B"/>
           <w:sz w:val="20"/>
         </w:rPr>
-        <w:t>Hasan, A. S. (2026). Chemistry Lab: A Web-Based Computational Chemistry Platform (Version 1.0.3) [Computer software]. Retrieved from https://github.com/abd19990044-commits/chemistry-web-lab</w:t>
+        <w:t>Hasan, A. S. (2026). Chemistry Lab: A Web-Based Computational Chemistry Platform (Version 1.0.3) [Computer software]. Zenodo. https://doi.org/10.5281/zenodo.22119038</w:t>
       </w:r>
     </w:p>
     <w:p>

</xml_diff>

<commit_message>
Harden scientific workflows, execution, web security and packaging; adopt MIT
</commit_message>
<xml_diff>
--- a/static/docs/ChemistryLab_User_Manual.docx
+++ b/static/docs/ChemistryLab_User_Manual.docx
@@ -128,7 +128,7 @@
                 <w:color w:val="1E293B"/>
                 <w:sz w:val="18"/>
               </w:rPr>
-              <w:t>Academic and Non-Commercial Research Suite (ORCA Web Lab License v1.1) • Zero Server Retention Policy</w:t>
+              <w:t>MIT-licensed Computational Chemistry Suite</w:t>
               <w:br/>
             </w:r>
             <w:r>
@@ -309,7 +309,7 @@
                 <w:color w:val="0B2C52"/>
                 <w:sz w:val="19"/>
               </w:rPr>
-              <w:t xml:space="preserve">📌 PRIVACY &amp; EPHEMERAL ARCHITECTURE: </w:t>
+              <w:t xml:space="preserve">📌 DATA STORAGE AND PRIVACY: </w:t>
             </w:r>
             <w:r>
               <w:rPr>
@@ -317,7 +317,7 @@
                 <w:color w:val="1E293B"/>
                 <w:sz w:val="19"/>
               </w:rPr>
-              <w:t>Chemistry Lab operates under a strict Zero-Retention Privacy Policy. All Kaggle API credentials, inputs, coordinates, and computation results remain in transient browser storage (localStorage/sessionStorage). No user data or credentials are stored or monetized on any server database.</w:t>
+              <w:t>Chemistry Lab uses server-side job and result stores. The optional credential vault stores encrypted Kaggle credentials. Retention depends on deployment settings. Administrators must configure access controls, storage, and backups.</w:t>
             </w:r>
           </w:p>
         </w:tc>
@@ -580,7 +580,7 @@
           <w:color w:val="1E293B"/>
           <w:sz w:val="20"/>
         </w:rPr>
-        <w:t>The ORCA 6.1 Input Generator follows a validated, multi-step sequential wizard model. It guarantees that generated ORCA input files (.inp) strictly obey ORCA syntax without syntax errors, unrecognized keywords, or silent parameter regressions.</w:t>
+        <w:t>The ORCA 6.1 Input Generator follows a validated, multi-step sequential wizard model. Generated inputs are validated against supported options; compatibility must also be checked with the installed ORCA version.</w:t>
       </w:r>
     </w:p>
     <w:p>
@@ -900,7 +900,7 @@
           <w:color w:val="1E293B"/>
           <w:sz w:val="20"/>
         </w:rPr>
-        <w:t>Scratch Disk Safety: `%maxdisk` safety guardrails preventing disk saturation.</w:t>
+        <w:t>Scratch Disk Safety: `%scf MaxDisk` safety guardrails preventing disk saturation.</w:t>
       </w:r>
     </w:p>
     <w:p>
@@ -2223,7 +2223,7 @@
               <w:br/>
               <w:t xml:space="preserve">  url          = {https://doi.org/10.5281/zenodo.22119038},</w:t>
               <w:br/>
-              <w:t xml:space="preserve">  note         = {Academic and Non-Commercial Research Platform}</w:t>
+              <w:t xml:space="preserve">  note         = {MIT-licensed Computational Chemistry Platform}</w:t>
               <w:br/>
               <w:t>}</w:t>
             </w:r>

</xml_diff>